<commit_message>
Plan Sprint 10.5 — White-Label Theming (Venzo)
Spec atualizada nos docs:
- Arquitetura_e_Plano_Implantacao_CRM.docx — Sprint 10.5 entre 10 e 11
  (semana 17.5): tabela tenant_settings.theme_config JSONB, --brand-*
  no RootLayout, cache Redis 1h, UI self-service paleta/fontes/logo,
  WCAG AA backend, "Powered by Venzo" 3-state por plano enforced
  server-side, matriz por plano, audit log, feature flag Unleash.
- CRM_Especificacao_e_Implementacao.docx — mesma seção espelhada.
- venzo_brand_guide.docx (novo) — design system completo da marca
  Venzo: paleta de cores (violeta + dourado), tipografia Plus Jakarta
  Sans, componentes (botões/badges/alertas), voz e tom, checklist de
  go-live. Vira fonte da verdade pra implementação.
- CLAUDE.md — Sprint atual aponta pro 10.5 com referência aos 3 docs.

Próximo passo (não neste commit): disparar o sprint na sessão paterna
com o prompt estruturado.

Co-Authored-By: Claude Opus 4.7 <noreply@anthropic.com>
</commit_message>
<xml_diff>
--- a/docs/Arquitetura_e_Plano_Implantacao_CRM.docx
+++ b/docs/Arquitetura_e_Plano_Implantacao_CRM.docx
@@ -1809,6 +1809,11 @@
       </w:r>
     </w:p>
     <w:p>
+      <w:r>
+        <w:t xml:space="preserve">tenant_settings      (id, tenant_id, theme_config [JSONB], powered_by, updated_at, ...)</w:t>
+      </w:r>
+    </w:p>
+    <w:p>
       <w:pPr>
         <w:spacing w:after="80" w:before="80"/>
       </w:pPr>
@@ -2598,7 +2603,7 @@
           <w:sz w:val="22"/>
           <w:szCs w:val="22"/>
         </w:rPr>
-        <w:t xml:space="preserve">MVP funcional para uso interno: Sprints 0 a 9 (~15 semanas). Produto pronto para comercialização: Sprints 0 a 14 (~20 semanas).</w:t>
+        <w:t>MVP funcional para uso interno: Sprints 0 a 9 (~16 semanas). Produto pronto para comercialização: Sprints 0 a 14 (~21 semanas).</w:t>
       </w:r>
     </w:p>
     <w:p>
@@ -4369,6 +4374,368 @@
         <w:spacing w:after="60" w:before="60"/>
       </w:pPr>
       <w:r>
+        <w:t xml:space="preserve"/>
+      </w:r>
+    </w:p>
+    <w:p>
+      <w:pPr/>
+      <w:r>
+        <w:rPr/>
+        <w:t xml:space="preserve"/>
+      </w:r>
+    </w:p>
+    <w:p>
+      <w:pPr/>
+      <w:r>
+        <w:rPr/>
+        <w:t xml:space="preserve">Critério de aceite: tenant troca paleta e logo → UI de todos os usuários do tenant reflete o novo tema em até 1h (cache TTL) ou imediatamente após hard refresh; badge "Powered by Venzo" visível em Starter, discreto em Growth, ausente em tenant Enterprise com poweredBy: "hidden"; cor com contraste abaixo de 4.5:1 é rejeitada com mensagem de erro e sugestão de cor alternativa.</w:t>
+      </w:r>
+    </w:p>
+    <w:p>
+      <w:pPr>
+        <w:numPr>
+          <w:ilvl w:val="0"/>
+          <w:numId w:val="1"/>
+        </w:numPr>
+      </w:pPr>
+      <w:r>
+        <w:rPr/>
+        <w:t xml:space="preserve">Feature flag (Unleash): tenant_theming_enabled — permite rollout gradual por plano antes do GA</w:t>
+      </w:r>
+    </w:p>
+    <w:p>
+      <w:pPr>
+        <w:numPr>
+          <w:ilvl w:val="0"/>
+          <w:numId w:val="1"/>
+        </w:numPr>
+      </w:pPr>
+      <w:r>
+        <w:rPr/>
+        <w:t xml:space="preserve">Auditoria: toda alteração de tema registrada em audit_logs com before/after do theme_config</w:t>
+      </w:r>
+    </w:p>
+    <w:p>
+      <w:pPr>
+        <w:numPr>
+          <w:ilvl w:val="0"/>
+          <w:numId w:val="1"/>
+        </w:numPr>
+      </w:pPr>
+      <w:r>
+        <w:rPr/>
+        <w:t xml:space="preserve">Rota tRPC: updateThemeConfig — valida contraste, salva no banco, invalida cache Redis, retorna novo theme_config</w:t>
+      </w:r>
+    </w:p>
+    <w:p>
+      <w:pPr>
+        <w:numPr>
+          <w:ilvl w:val="0"/>
+          <w:numId w:val="1"/>
+        </w:numPr>
+      </w:pPr>
+      <w:r>
+        <w:rPr/>
+        <w:t xml:space="preserve">Matriz de personalização por plano: Starter (sem customização), Growth (lista curada de cores e fontes + logo), Enterprise (hex livre + fontes custom + domínio próprio)</w:t>
+      </w:r>
+    </w:p>
+    <w:p>
+      <w:pPr>
+        <w:numPr>
+          <w:ilvl w:val="0"/>
+          <w:numId w:val="1"/>
+        </w:numPr>
+      </w:pPr>
+      <w:r>
+        <w:rPr/>
+        <w:t xml:space="preserve">  Enterprise: poweredBy: "hidden" — removível pelo Admin; off por padrão</w:t>
+      </w:r>
+    </w:p>
+    <w:p>
+      <w:pPr>
+        <w:numPr>
+          <w:ilvl w:val="0"/>
+          <w:numId w:val="1"/>
+        </w:numPr>
+      </w:pPr>
+      <w:r>
+        <w:rPr/>
+        <w:t xml:space="preserve">  Growth:  poweredBy: "subtle"  — badge discreto 9px, cinza, rodapé canto direito</w:t>
+      </w:r>
+    </w:p>
+    <w:p>
+      <w:pPr>
+        <w:numPr>
+          <w:ilvl w:val="0"/>
+          <w:numId w:val="1"/>
+        </w:numPr>
+      </w:pPr>
+      <w:r>
+        <w:rPr/>
+        <w:t xml:space="preserve">  Starter: poweredBy: "visible" — badge proeminente 14px, cor primária, rodapé centro</w:t>
+      </w:r>
+    </w:p>
+    <w:p>
+      <w:pPr>
+        <w:numPr>
+          <w:ilvl w:val="0"/>
+          <w:numId w:val="1"/>
+        </w:numPr>
+      </w:pPr>
+      <w:r>
+        <w:rPr/>
+        <w:t xml:space="preserve">"Powered by Venzo" three-state por plano — campo poweredBy no theme_config, enforced server-side (não apenas frontend):</w:t>
+      </w:r>
+    </w:p>
+    <w:p>
+      <w:pPr>
+        <w:numPr>
+          <w:ilvl w:val="0"/>
+          <w:numId w:val="1"/>
+        </w:numPr>
+      </w:pPr>
+      <w:r>
+        <w:rPr/>
+        <w:t xml:space="preserve">Preview ao vivo antes de publicar: Admin vê a UI com o novo tema sem afetar sessões ativas de outros usuários</w:t>
+      </w:r>
+    </w:p>
+    <w:p>
+      <w:pPr>
+        <w:numPr>
+          <w:ilvl w:val="0"/>
+          <w:numId w:val="1"/>
+        </w:numPr>
+      </w:pPr>
+      <w:r>
+        <w:rPr/>
+        <w:t xml:space="preserve">Validação WCAG AA no backend antes de publicar: contraste mínimo 4.5:1 para texto normal; sugestão automática de sombra mais escura se a cor escolhida reprovar</w:t>
+      </w:r>
+    </w:p>
+    <w:p>
+      <w:pPr>
+        <w:numPr>
+          <w:ilvl w:val="0"/>
+          <w:numId w:val="1"/>
+        </w:numPr>
+      </w:pPr>
+      <w:r>
+        <w:rPr/>
+        <w:t xml:space="preserve">UI self-service no painel Admin: seletor de paleta de cores por hex livre (Enterprise) ou lista curada de 8 combinações pré-validadas (Growth); lista de 6 fontes Google Fonts aprovadas; upload de logo para R2/S3 CDN</w:t>
+      </w:r>
+    </w:p>
+    <w:p>
+      <w:pPr>
+        <w:numPr>
+          <w:ilvl w:val="0"/>
+          <w:numId w:val="1"/>
+        </w:numPr>
+      </w:pPr>
+      <w:r>
+        <w:rPr/>
+        <w:t xml:space="preserve">Cache Redis com TTL 1h por tenant_id; invalidação imediata ao salvar nova configuração</w:t>
+      </w:r>
+    </w:p>
+    <w:p>
+      <w:pPr>
+        <w:numPr>
+          <w:ilvl w:val="0"/>
+          <w:numId w:val="1"/>
+        </w:numPr>
+      </w:pPr>
+      <w:r>
+        <w:rPr/>
+        <w:t xml:space="preserve">CSS custom properties --brand-* injetadas no RootLayout (Next.js Server Component) a partir do theme_config do tenant ativo</w:t>
+      </w:r>
+    </w:p>
+    <w:p>
+      <w:pPr>
+        <w:numPr>
+          <w:ilvl w:val="0"/>
+          <w:numId w:val="1"/>
+        </w:numPr>
+      </w:pPr>
+      <w:r>
+        <w:rPr/>
+        <w:t xml:space="preserve">Tabela tenant_settings com coluna theme_config JSONB: { primaryColor, primaryDark, primaryLight, accentColor, fontFamily, logoUrl, poweredBy }</w:t>
+      </w:r>
+    </w:p>
+    <w:p>
+      <w:pPr/>
+      <w:r>
+        <w:rPr/>
+        <w:t xml:space="preserve">Objetivo: Camada de personalização visual por tenant: paleta de cores, tipografia e logo self-service, com "Powered by Venzo" gerenciado por plano.</w:t>
+      </w:r>
+    </w:p>
+    <w:p>
+      <w:pPr>
+        <w:spacing w:after="80"/>
+      </w:pPr>
+      <w:r>
+        <w:rPr/>
+        <w:t xml:space="preserve"/>
+      </w:r>
+    </w:p>
+    <w:p>
+      <w:pPr>
+        <w:spacing w:after="80"/>
+      </w:pPr>
+      <w:r>
+        <w:rPr>
+          <w:b/>
+        </w:rPr>
+        <w:t xml:space="preserve">Sprint 10.5 — White-Label Theming e Identidade da Plataforma (Semana 17.5)</w:t>
+      </w:r>
+    </w:p>
+    <w:p>
+      <w:pPr>
+        <w:spacing w:after="80"/>
+      </w:pPr>
+      <w:r>
+        <w:rPr/>
+        <w:t xml:space="preserve">Objetivo: Camada de personalização visual por tenant: paleta de cores, tipografia e logo self-service, com "Powered by Venzo" gerenciado por plano.</w:t>
+      </w:r>
+    </w:p>
+    <w:p>
+      <w:pPr>
+        <w:spacing w:after="80"/>
+      </w:pPr>
+      <w:r>
+        <w:rPr/>
+        <w:t xml:space="preserve">• Tabela tenant_settings com coluna theme_config JSONB: { primaryColor, primaryDark, primaryLight, accentColor, fontFamily, logoUrl, poweredBy }</w:t>
+      </w:r>
+    </w:p>
+    <w:p>
+      <w:pPr>
+        <w:spacing w:after="80"/>
+      </w:pPr>
+      <w:r>
+        <w:rPr/>
+        <w:t xml:space="preserve">• CSS custom properties --brand-* injetadas no RootLayout (Next.js Server Component) a partir do theme_config do tenant ativo</w:t>
+      </w:r>
+    </w:p>
+    <w:p>
+      <w:pPr>
+        <w:spacing w:after="80"/>
+      </w:pPr>
+      <w:r>
+        <w:rPr/>
+        <w:t xml:space="preserve">• Cache Redis com TTL 1h por tenant_id; invalidação imediata ao salvar nova configuração</w:t>
+      </w:r>
+    </w:p>
+    <w:p>
+      <w:pPr>
+        <w:spacing w:after="80"/>
+      </w:pPr>
+      <w:r>
+        <w:rPr/>
+        <w:t xml:space="preserve">• UI self-service no painel Admin: seletor de paleta de cores por hex livre (Enterprise) ou lista curada de 8 combinações pré-validadas (Growth); lista de 6 fontes Google Fonts aprovadas; upload de logo para R2/S3 CDN</w:t>
+      </w:r>
+    </w:p>
+    <w:p>
+      <w:pPr>
+        <w:spacing w:after="80"/>
+      </w:pPr>
+      <w:r>
+        <w:rPr/>
+        <w:t xml:space="preserve">• Validação WCAG AA no backend antes de publicar: contraste mínimo 4.5:1 para texto normal; sugestão automática de sombra mais escura se a cor escolhida reprovar</w:t>
+      </w:r>
+    </w:p>
+    <w:p>
+      <w:pPr>
+        <w:spacing w:after="80"/>
+      </w:pPr>
+      <w:r>
+        <w:rPr/>
+        <w:t xml:space="preserve">• Preview ao vivo antes de publicar: Admin vê a UI com o novo tema sem afetar sessões ativas de outros usuários</w:t>
+      </w:r>
+    </w:p>
+    <w:p>
+      <w:pPr>
+        <w:spacing w:after="80"/>
+      </w:pPr>
+      <w:r>
+        <w:rPr/>
+        <w:t xml:space="preserve">• "Powered by Venzo" three-state por plano — campo poweredBy no theme_config, enforced server-side:</w:t>
+      </w:r>
+    </w:p>
+    <w:p>
+      <w:pPr>
+        <w:spacing w:after="80"/>
+      </w:pPr>
+      <w:r>
+        <w:rPr/>
+        <w:t xml:space="preserve">     Starter: poweredBy: "visible" — badge proeminente 14px, cor primária, rodapé centro</w:t>
+      </w:r>
+    </w:p>
+    <w:p>
+      <w:pPr>
+        <w:spacing w:after="80"/>
+      </w:pPr>
+      <w:r>
+        <w:rPr/>
+        <w:t xml:space="preserve">     Growth:  poweredBy: "subtle"  — badge discreto 9px, cinza, rodapé canto direito</w:t>
+      </w:r>
+    </w:p>
+    <w:p>
+      <w:pPr>
+        <w:spacing w:after="80"/>
+      </w:pPr>
+      <w:r>
+        <w:rPr/>
+        <w:t xml:space="preserve">     Enterprise: poweredBy: "hidden" — removível pelo Admin; off por padrão</w:t>
+      </w:r>
+    </w:p>
+    <w:p>
+      <w:pPr>
+        <w:spacing w:after="80"/>
+      </w:pPr>
+      <w:r>
+        <w:rPr/>
+        <w:t xml:space="preserve">• Matriz de personalização por plano: Starter (sem customização), Growth (lista curada de cores e fontes + logo), Enterprise (hex livre + fontes custom + domínio próprio)</w:t>
+      </w:r>
+    </w:p>
+    <w:p>
+      <w:pPr>
+        <w:spacing w:after="80"/>
+      </w:pPr>
+      <w:r>
+        <w:rPr/>
+        <w:t xml:space="preserve">• Rota tRPC: updateThemeConfig — valida contraste, salva no banco, invalida cache Redis, retorna novo theme_config</w:t>
+      </w:r>
+    </w:p>
+    <w:p>
+      <w:pPr>
+        <w:spacing w:after="80"/>
+      </w:pPr>
+      <w:r>
+        <w:rPr/>
+        <w:t xml:space="preserve">• Auditoria: toda alteração de tema registrada em audit_logs com before/after do theme_config</w:t>
+      </w:r>
+    </w:p>
+    <w:p>
+      <w:pPr>
+        <w:spacing w:after="80"/>
+      </w:pPr>
+      <w:r>
+        <w:rPr/>
+        <w:t xml:space="preserve">• Feature flag (Unleash): tenant_theming_enabled — permite rollout gradual por plano antes do GA</w:t>
+      </w:r>
+    </w:p>
+    <w:p>
+      <w:pPr>
+        <w:spacing w:after="80"/>
+      </w:pPr>
+      <w:r>
+        <w:rPr/>
+        <w:t xml:space="preserve">Critério de aceite: tenant troca paleta e logo → UI de todos os usuários do tenant reflete o novo tema em até 1h (cache TTL) ou imediatamente após hard refresh; badge "Powered by Venzo" visível em Starter, discreto em Growth, ausente em tenant Enterprise com poweredBy: "hidden"; cor com contraste abaixo de 4.5:1 é rejeitada com mensagem de erro e sugestão de cor alternativa.</w:t>
+      </w:r>
+    </w:p>
+    <w:p>
+      <w:pPr>
+        <w:spacing w:after="80"/>
+      </w:pPr>
+      <w:r>
+        <w:rPr/>
         <w:t xml:space="preserve"/>
       </w:r>
     </w:p>

</xml_diff>